<commit_message>
Update final handoff report
</commit_message>
<xml_diff>
--- a/docs/Acoustic Project Handoff Report.docx
+++ b/docs/Acoustic Project Handoff Report.docx
@@ -143,16 +143,7 @@
           <w:szCs w:val="24"/>
           <w:rtl w:val="0"/>
         </w:rPr>
-        <w:t xml:space="preserve">The acoustic data were obtained from the publicly available Mars Analyst Notebook maintained by NASA's PDS Geosciences Node at Washington University in St. Louis. All observations originated from SuperCam FITS products. Earlier Crater Floor recordings were converted to WAV files before analysis, while Delta Front and Upper Fan recordings were later processed directly from the FITS files</w:t>
-      </w:r>
-      <w:r>
-        <w:rPr>
-          <w:rFonts w:ascii="Times New Roman" w:cs="Times New Roman" w:eastAsia="Times New Roman" w:hAnsi="Times New Roman"/>
-          <w:sz w:val="24"/>
-          <w:szCs w:val="24"/>
-          <w:rtl w:val="0"/>
-        </w:rPr>
-        <w:t xml:space="preserve"> as part of a faster processing workflow. </w:t>
+        <w:t xml:space="preserve">The acoustic data were obtained from the publicly available Mars Analyst Notebook maintained by NASA's PDS Geosciences Node at Washington University in St. Louis. All observations originated from SuperCam FITS products. Earlier Crater Floor recordings were converted to WAV files before analysis. For the Delta Front and Upper Fan expansion, the downloaded SuperCam products were retained as ZIP archives because of an extraction/access issue encountered during processing. The workflow reads the relevant FITS product from each archive, extracts the SOUND arrays, and writes concatenated multishot WAV files before the selected shot is analyzed. </w:t>
       </w:r>
       <w:r>
         <w:rPr>
@@ -1411,7 +1402,7 @@
           <w:szCs w:val="24"/>
           <w:rtl w:val="0"/>
         </w:rPr>
-        <w:t xml:space="preserve">Raw acoustic source files are retained in data/raw/. The Crater Floor directory contains the retained FITS and WAV products, while the Delta Front and Upper Fan directories contain the original downloaded SuperCam products used by the later processing workflow. The repository README documents the folder structure and processing sequence. For reproducing the final results, only the 293-row processed dataset and 04_statistical_analysis.ipynb are required.</w:t>
+        <w:t xml:space="preserve">Raw acoustic source files are retained in data/raw/. The Crater Floor directory contains the retained FITS and WAV products, while the Delta Front and Upper Fan directories contain the original downloaded SuperCam products as ZIP archives used by the later processing workflow. The repository README documents the folder structure and processing sequence. For reproducing the final results, only the 293-row processed dataset and 04_statistical_analysis.ipynb are required.</w:t>
       </w:r>
     </w:p>
     <w:p>

</xml_diff>